<commit_message>
docs: regenerate document set at 54 functional requirements
</commit_message>
<xml_diff>
--- a/docs/PD_Design_Document_v1.0.docx
+++ b/docs/PD_Design_Document_v1.0.docx
@@ -814,6 +814,57 @@
       </w:pPr>
       <w:r>
         <w:t xml:space="preserve">Coordinates come from settings when the user has set them, otherwise from an IP lookup with a second provider and a fixed default behind it. Forecast and air-quality calls return current conditions, an eight-hour outlook, daily extremes, UV, sunrise and sunset, and a US AQI band. Manual coordinates keep the location entirely off the network. Satisfies FUN-023, FUN-024 and mitigates RSK-009.</w:t>
+      </w:r>
+    </w:p>
+    <w:p>
+      <w:pPr>
+        <w:pStyle w:val="Heading2"/>
+        <w:spacing w:after="120" w:before="240"/>
+      </w:pPr>
+      <w:r>
+        <w:t xml:space="preserve">4.9 Symbol search</w:t>
+      </w:r>
+    </w:p>
+    <w:p>
+      <w:pPr>
+        <w:spacing w:after="120"/>
+      </w:pPr>
+      <w:r>
+        <w:t xml:space="preserve">The add-holding dialog queries Yahoo's symbol directory as the user types, so a person can enter "reliance" or "tata" rather than knowing that the ticker is RELIANCE.NS. Results keep equities, ETFs, indices, funds, currencies and crypto, are sorted to put Indian listings first, and are cached for five minutes. Keyboard navigation is supported so the dialog is usable without a mouse. Satisfies FUN-040.</w:t>
+      </w:r>
+    </w:p>
+    <w:p>
+      <w:pPr>
+        <w:pStyle w:val="Heading2"/>
+        <w:spacing w:after="120" w:before="240"/>
+      </w:pPr>
+      <w:r>
+        <w:t xml:space="preserve">4.10 Price at a chosen moment</w:t>
+      </w:r>
+    </w:p>
+    <w:p>
+      <w:pPr>
+        <w:spacing w:after="120"/>
+      </w:pPr>
+      <w:r>
+        <w:t xml:space="preserve">A purchase is either "right now", which uses the live quote, or an exact past date and time. For a past moment the service requests a window around that timestamp at the finest interval the provider still serves for that age — fifteen minutes inside two months, then hourly, then daily, then weekly — and picks the closest candle. Markets are shut most of the time, so the window widens step by step until a real trade exists, and the dialog says whether it found the exact moment or the nearest trading time. The dialog then shows the amount invested and, for past purchases, the gain or loss against the live price before anything is saved. The auto-filled price is always editable and is relabelled as the user's own figure once touched. Satisfies FUN-041 to FUN-044.</w:t>
+      </w:r>
+    </w:p>
+    <w:p>
+      <w:pPr>
+        <w:pStyle w:val="Heading2"/>
+        <w:spacing w:after="120" w:before="240"/>
+      </w:pPr>
+      <w:r>
+        <w:t xml:space="preserve">4.11 Popular and steady</w:t>
+      </w:r>
+    </w:p>
+    <w:p>
+      <w:pPr>
+        <w:spacing w:after="120"/>
+      </w:pPr>
+      <w:r>
+        <w:t xml:space="preserve">A fixed list of twenty widely-held Indian and US large caps is fetched as a year of daily candles. Annualised volatility is computed from log returns and banded into very steady, steady, moves a lot and volatile; the list is ordered calmest first and shows the one-year return beside it. This is deliberately the opposite selection to the hype radar, and the card states in plain text that it is not advice. Satisfies FUN-048 and FUN-049.</w:t>
       </w:r>
     </w:p>
     <w:p>
@@ -1447,6 +1498,23 @@
       </w:pPr>
       <w:r>
         <w:t xml:space="preserve">GitHub Pages, GitHub Releases, GitHub Actions on a public repository, Cloudflare Workers and Cloudflare D1 all operate inside permanently free tiers at the scale this application generates. There is no paid dependency anywhere in the delivery chain; the deliberate exclusions — app store listings and code signing — are recorded with their costs in PD-DEP-001. Satisfies NFR-013.</w:t>
+      </w:r>
+    </w:p>
+    <w:p>
+      <w:pPr>
+        <w:pStyle w:val="Heading2"/>
+        <w:spacing w:after="120" w:before="240"/>
+      </w:pPr>
+      <w:r>
+        <w:t xml:space="preserve">10.6 Operating without a command line</w:t>
+      </w:r>
+    </w:p>
+    <w:p>
+      <w:pPr>
+        <w:spacing w:after="120"/>
+      </w:pPr>
+      <w:r>
+        <w:t xml:space="preserve">The worker is also emitted as a single bundled file, which can be pasted directly into the Cloudflare dashboard editor; combined with GitHub Desktop, the GitHub Pages settings page and the Releases page, the entire publish path becomes website buttons. Two double-click batch launchers cover running the app and regenerating the pasteable worker file, each checking for Node and explaining in plain language what to do if it is missing. HOW-TO-PUBLISH.md and INSTALL.md carry the click-by-click instructions for the operator and for end users respectively. Satisfies FUN-052 and FUN-053.</w:t>
       </w:r>
     </w:p>
     <w:p>

</xml_diff>

<commit_message>
docs: regenerate document set at 63 functional requirements
RTM now 63 functional / 16 security / 14 NFR; Code Register 41 rows;
Charter and SDD carry the mutual funds, stock chart, sector filter,
financial-hub weather and disclaimer scope added this round.
</commit_message>
<xml_diff>
--- a/docs/PD_Design_Document_v1.0.docx
+++ b/docs/PD_Design_Document_v1.0.docx
@@ -796,7 +796,7 @@
         <w:spacing w:after="120"/>
       </w:pPr>
       <w:r>
-        <w:t xml:space="preserve">Session state is computed locally from exchange trading hours using time-zone-aware formatting, with weekend handling and a countdown to the next open or close. Breadth counts advancers against decliners across the tracked universe, and the pulse score blends the advance-decline ratio, average move, the VIX band, the news skew and the crypto Fear and Greed reading into a bounded mood score. Satisfies FUN-021 and FUN-022.</w:t>
+        <w:t xml:space="preserve">Session state is computed locally from exchange trading hours using time-zone-aware formatting, with weekend handling and a countdown to the next open or close; each exchange row states "Open now · closes in …" or "Closed · opens in …" rather than a bare countdown, with a matching OPEN/CLOSED badge. Breadth counts advancers against decliners across the tracked universe, and the pulse score blends the advance-decline ratio, average move, the VIX band, the news skew and the crypto Fear and Greed reading into a bounded mood score. Satisfies FUN-021, FUN-022 and FUN-063.</w:t>
       </w:r>
     </w:p>
     <w:p>
@@ -813,7 +813,7 @@
         <w:spacing w:after="120"/>
       </w:pPr>
       <w:r>
-        <w:t xml:space="preserve">Coordinates come from settings when the user has set them, otherwise from an IP lookup with a second provider and a fixed default behind it. Forecast and air-quality calls return current conditions, an eight-hour outlook, daily extremes, UV, sunrise and sunset, and a US AQI band. Manual coordinates keep the location entirely off the network. Satisfies FUN-023, FUN-024 and mitigates RSK-009.</w:t>
+        <w:t xml:space="preserve">Coordinates come from settings when the user has set them, otherwise from an IP lookup with a second provider and a fixed default behind it. Forecast and air-quality calls return current conditions, an eight-hour outlook, daily extremes, UV, sunrise and sunset, and a US AQI band. Manual coordinates keep the location entirely off the network. A second, independent call fetches current temperature and conditions for a fixed set of six financial-hub cities (Mumbai, New York, London, Tokyo, Hong Kong, Frankfurt) so the user sees weather at the exchanges that move markets, not only at home. Satisfies FUN-023, FUN-024, FUN-062 and mitigates RSK-009.</w:t>
       </w:r>
     </w:p>
     <w:p>
@@ -847,7 +847,7 @@
         <w:spacing w:after="120"/>
       </w:pPr>
       <w:r>
-        <w:t xml:space="preserve">A purchase is either "right now", which uses the live quote, or an exact past date and time. For a past moment the service requests a window around that timestamp at the finest interval the provider still serves for that age — fifteen minutes inside two months, then hourly, then daily, then weekly — and picks the closest candle. Markets are shut most of the time, so the window widens step by step until a real trade exists, and the dialog says whether it found the exact moment or the nearest trading time. The dialog then shows the amount invested and, for past purchases, the gain or loss against the live price before anything is saved. The auto-filled price is always editable and is relabelled as the user's own figure once touched. Satisfies FUN-041 to FUN-044.</w:t>
+        <w:t xml:space="preserve">A purchase is either "right now", which uses the live quote, or an exact past date and time. For a past moment the service requests a window around that timestamp at the finest interval the provider still serves for that age — fifteen minutes inside two months, then hourly, then daily, then weekly — and picks the closest candle. Markets are shut most of the time, so the window widens step by step until a real trade exists, and the dialog says whether it found the exact moment or the nearest trading time. The dialog then shows the amount invested and, for past purchases, the gain or loss against the live price before anything is saved. The auto-filled price is always editable and is relabelled as the user's own figure once touched. A quantity/amount toggle lets the field hold either a share count or a money figure; in amount mode the quantity is derived as amount ÷ price before the preview and the save call. Satisfies FUN-041 to FUN-044 and FUN-054.</w:t>
       </w:r>
     </w:p>
     <w:p>
@@ -864,7 +864,41 @@
         <w:spacing w:after="120"/>
       </w:pPr>
       <w:r>
-        <w:t xml:space="preserve">A fixed list of twenty widely-held Indian and US large caps is fetched as a year of daily candles. Annualised volatility is computed from log returns and banded into very steady, steady, moves a lot and volatile; the list is ordered calmest first and shows the one-year return beside it. This is deliberately the opposite selection to the hype radar, and the card states in plain text that it is not advice. Satisfies FUN-048 and FUN-049.</w:t>
+        <w:t xml:space="preserve">A fixed list of thirty widely-held Indian and US large caps, each tagged with a sector, is fetched as a year of daily candles. Annualised volatility is computed from log returns and banded into very steady, steady, moves a lot and volatile; the list is ordered calmest first and shows the one-year return beside it, and can be narrowed by market or by sector using a dropdown populated from the data actually returned. This is deliberately the opposite selection to the hype radar, and the card states in plain text that it is not advice. Satisfies FUN-048, FUN-049 and FUN-060.</w:t>
+      </w:r>
+    </w:p>
+    <w:p>
+      <w:pPr>
+        <w:pStyle w:val="Heading2"/>
+        <w:spacing w:after="120" w:before="240"/>
+      </w:pPr>
+      <w:r>
+        <w:t xml:space="preserve">4.12 Mutual funds</w:t>
+      </w:r>
+    </w:p>
+    <w:p>
+      <w:pPr>
+        <w:spacing w:after="120"/>
+      </w:pPr>
+      <w:r>
+        <w:t xml:space="preserve">Fourteen well-known Indian direct-growth schemes are pinned by their permanent AMFI scheme code rather than resolved by name search at run time, because mfapi.in's free-text search is capped and unranked and several of these funds have been renamed by their AMC since launch (for example "SBI Bluechip" is now "SBI Large Cap", "Kotak Emerging Equity" is now "Kotak Midcap"). Each scheme's full NAV history is fetched once, cached for six hours, and used to derive the latest NAV plus one-day, one-month and one-year change from the dated NAV series. Satisfies FUN-055, FUN-056 and SEC-016.</w:t>
+      </w:r>
+    </w:p>
+    <w:p>
+      <w:pPr>
+        <w:pStyle w:val="Heading2"/>
+        <w:spacing w:after="120" w:before="240"/>
+      </w:pPr>
+      <w:r>
+        <w:t xml:space="preserve">4.13 Stock detail chart</w:t>
+      </w:r>
+    </w:p>
+    <w:p>
+      <w:pPr>
+        <w:spacing w:after="120"/>
+      </w:pPr>
+      <w:r>
+        <w:t xml:space="preserve">A single history function maps six range keys (1D, 5D, 1M, 6M, 1Y, 5Y) to a Yahoo range-and-interval pair and returns the full timestamped close series for that window, not just the sixty-point sparkline slice used elsewhere. The renderer draws this as an inline SVG area chart and refetches on each range-tab click. A shared matcher filters the already-fetched news wire by ticker or by company-name keyword — no extra network call — and the same matcher backs the recent-news strip in the add-holding dialog; the price chart is drawn from past prices only and is labelled as a pattern read, not a forecast. Satisfies FUN-058 and FUN-059.</w:t>
       </w:r>
     </w:p>
     <w:p>
@@ -907,7 +941,7 @@
         <w:spacing w:after="120"/>
       </w:pPr>
       <w:r>
-        <w:t xml:space="preserve">A four-column grid: the hype radar spans the full width, then portfolio and news wire, then crypto and the weather-plus-clocks card. Because cards clip their own overflow, grid rows cannot size themselves from content, so each card declares the height its internal scroll areas are designed around; breakpoints at 980 px and 620 px reduce the grid to two columns and then one, and raise the card heights where the statistics block wraps. Compact mode drops to two columns and hides the allocation donut and the hourly weather strip. Satisfies FUN-031 and NFR-006.</w:t>
+        <w:t xml:space="preserve">A four-column grid, portfolio first and full width, then the hype radar full width, then news wire and crypto, then popular-and-steady paired with mutual funds, then a full-width weather-and-markets card split internally into a weather-plus-financial-hubs column and a market-clocks column. Because cards clip their own overflow, grid rows cannot size themselves from content, so each card declares the height its internal scroll areas are designed around; breakpoints at 980 px and 620 px reduce the grid to two columns and then one, collapse the weather/markets split to a single column, and raise card heights where content wraps. Modals cap themselves at 88vh (92vh on phones) with internal scrolling so a tall dialog like the add-holding form or the stock chart never runs off a short screen. Compact mode drops to two columns and hides the allocation donut and the hourly weather strip. Satisfies FUN-031, FUN-047 and NFR-006.</w:t>
       </w:r>
     </w:p>
     <w:p>
@@ -924,24 +958,24 @@
         <w:spacing w:after="120"/>
       </w:pPr>
       <w:r>
-        <w:t xml:space="preserve">A single render function receives payload patches and calls only the section renderers whose data changed. Sparklines and the allocation donut are built as inline SVG strings with gradient fills; currency formatting is lakh and crore aware for Indian rupees and compact for other currencies; sub-cent crypto prices are shown in full decimals rather than exponent notation. Satisfies FUN-009 and FUN-015.</w:t>
-      </w:r>
-    </w:p>
-    <w:p>
-      <w:pPr>
-        <w:pStyle w:val="Heading2"/>
-        <w:spacing w:after="120" w:before="240"/>
-      </w:pPr>
-      <w:r>
-        <w:t xml:space="preserve">5.4 Accessibility and readability</w:t>
-      </w:r>
-    </w:p>
-    <w:p>
-      <w:pPr>
-        <w:spacing w:after="120"/>
-      </w:pPr>
-      <w:r>
-        <w:t xml:space="preserve">Direction is never carried by colour alone — every rise or fall is also marked with an arrow glyph and a signed percentage, and news items carry a written confidence figure alongside the coloured bar. Numeric columns use tabular figures so digits align while values tick. Satisfies NFR-007.</w:t>
+        <w:t xml:space="preserve">A single render function receives payload patches and calls only the section renderers whose data changed. Sparklines, the allocation donut and the stock detail chart are built as inline SVG strings with gradient fills; currency formatting is lakh and crore aware for Indian rupees and compact for other currencies; sub-cent crypto prices are shown in full decimals rather than exponent notation. Satisfies FUN-009, FUN-015 and FUN-058.</w:t>
+      </w:r>
+    </w:p>
+    <w:p>
+      <w:pPr>
+        <w:pStyle w:val="Heading2"/>
+        <w:spacing w:after="120" w:before="240"/>
+      </w:pPr>
+      <w:r>
+        <w:t xml:space="preserve">5.4 Accessibility, readability and disclaimers</w:t>
+      </w:r>
+    </w:p>
+    <w:p>
+      <w:pPr>
+        <w:spacing w:after="120"/>
+      </w:pPr>
+      <w:r>
+        <w:t xml:space="preserve">Direction is never carried by colour alone — every rise or fall is also marked with an arrow glyph and a signed percentage, and news items carry a written confidence figure alongside the coloured bar. Numeric columns use tabular figures so digits align while values tick. Every card that carries a predictive or "likely" read — hype radar, the all-scanned list, news wire, popular and steady, mutual funds — ends with a short, visible not-investment-advice line; hype and news additionally spell out in words what the score or the badge means. Satisfies NFR-007, FUN-061 and NFR-014.</w:t>
       </w:r>
     </w:p>
     <w:p>

</xml_diff>